<commit_message>
components, logging and exceptions
</commit_message>
<xml_diff>
--- a/Documentation.docx
+++ b/Documentation.docx
@@ -487,8 +487,126 @@
       <w:r>
         <w:t>–r requirements.txt</w:t>
       </w:r>
+    </w:p>
+    <w:p>
+      <w:pPr>
+        <w:pBdr>
+          <w:bottom w:val="single" w:sz="6" w:space="1" w:color="auto"/>
+        </w:pBdr>
+        <w:spacing w:line="240" w:lineRule="auto"/>
+      </w:pPr>
+    </w:p>
+    <w:p>
+      <w:pPr>
+        <w:spacing w:line="240" w:lineRule="auto"/>
+      </w:pPr>
+      <w:r>
+        <w:t>Project structure, Logging and exceptions handling</w:t>
+      </w:r>
+    </w:p>
+    <w:p>
+      <w:pPr>
+        <w:spacing w:line="240" w:lineRule="auto"/>
+      </w:pPr>
+      <w:r>
+        <w:rPr>
+          <w:i/>
+        </w:rPr>
+        <w:t>Note that this will be done manually for the sake of jogging our memory, but usually the project structure can be created automatically with a template.py script</w:t>
+      </w:r>
+      <w:r>
+        <w:rPr>
+          <w:i/>
+        </w:rPr>
+        <w:br/>
+      </w:r>
+      <w:r>
+        <w:rPr>
+          <w:i/>
+        </w:rPr>
+        <w:br/>
+      </w:r>
+      <w:r>
+        <w:t>…</w:t>
+      </w:r>
+    </w:p>
+    <w:p>
+      <w:pPr>
+        <w:spacing w:line="240" w:lineRule="auto"/>
+      </w:pPr>
+      <w:r>
+        <w:t xml:space="preserve">In </w:t>
+      </w:r>
+      <w:proofErr w:type="spellStart"/>
+      <w:r>
+        <w:t>src</w:t>
+      </w:r>
+      <w:proofErr w:type="spellEnd"/>
+      <w:r>
+        <w:t xml:space="preserve"> we create;</w:t>
+      </w:r>
+    </w:p>
+    <w:p>
+      <w:pPr>
+        <w:pStyle w:val="ListParagraph"/>
+        <w:numPr>
+          <w:ilvl w:val="0"/>
+          <w:numId w:val="3"/>
+        </w:numPr>
+        <w:spacing w:line="240" w:lineRule="auto"/>
+      </w:pPr>
+      <w:r>
+        <w:t>Components folder with __init__.py inside, for all the modules that would be created.</w:t>
+      </w:r>
+    </w:p>
+    <w:p>
+      <w:pPr>
+        <w:pStyle w:val="ListParagraph"/>
+        <w:numPr>
+          <w:ilvl w:val="0"/>
+          <w:numId w:val="3"/>
+        </w:numPr>
+        <w:spacing w:line="240" w:lineRule="auto"/>
+      </w:pPr>
+      <w:r>
+        <w:t xml:space="preserve">Pipeline with </w:t>
+      </w:r>
+      <w:proofErr w:type="spellStart"/>
+      <w:r>
+        <w:t>init</w:t>
+      </w:r>
+      <w:proofErr w:type="spellEnd"/>
+      <w:r>
+        <w:t xml:space="preserve"> and required modules</w:t>
+      </w:r>
       <w:bookmarkStart w:id="0" w:name="_GoBack"/>
       <w:bookmarkEnd w:id="0"/>
+    </w:p>
+    <w:p>
+      <w:pPr>
+        <w:pStyle w:val="ListParagraph"/>
+        <w:numPr>
+          <w:ilvl w:val="0"/>
+          <w:numId w:val="3"/>
+        </w:numPr>
+        <w:spacing w:line="240" w:lineRule="auto"/>
+      </w:pPr>
+      <w:r>
+        <w:t xml:space="preserve">Then create logging, exceptions and </w:t>
+      </w:r>
+      <w:proofErr w:type="spellStart"/>
+      <w:r>
+        <w:t>utils</w:t>
+      </w:r>
+      <w:proofErr w:type="spellEnd"/>
+      <w:r>
+        <w:t xml:space="preserve"> in </w:t>
+      </w:r>
+      <w:proofErr w:type="spellStart"/>
+      <w:r>
+        <w:t>src</w:t>
+      </w:r>
+      <w:proofErr w:type="spellEnd"/>
     </w:p>
     <w:p>
       <w:pPr>
@@ -508,6 +626,118 @@
 <file path=word/numbering.xml><?xml version="1.0" encoding="utf-8"?>
 <w:numbering xmlns:wpc="http://schemas.microsoft.com/office/word/2010/wordprocessingCanvas" xmlns:cx="http://schemas.microsoft.com/office/drawing/2014/chartex" xmlns:mc="http://schemas.openxmlformats.org/markup-compatibility/2006" xmlns:o="urn:schemas-microsoft-com:office:office" xmlns:r="http://schemas.openxmlformats.org/officeDocument/2006/relationships" xmlns:m="http://schemas.openxmlformats.org/officeDocument/2006/math" xmlns:v="urn:schemas-microsoft-com:vml" xmlns:wp14="http://schemas.microsoft.com/office/word/2010/wordprocessingDrawing" xmlns:wp="http://schemas.openxmlformats.org/drawingml/2006/wordprocessingDrawing" xmlns:w10="urn:schemas-microsoft-com:office:word" xmlns:w="http://schemas.openxmlformats.org/wordprocessingml/2006/main" xmlns:w14="http://schemas.microsoft.com/office/word/2010/wordml" xmlns:w15="http://schemas.microsoft.com/office/word/2012/wordml" xmlns:w16se="http://schemas.microsoft.com/office/word/2015/wordml/symex" xmlns:wpg="http://schemas.microsoft.com/office/word/2010/wordprocessingGroup" xmlns:wpi="http://schemas.microsoft.com/office/word/2010/wordprocessingInk" xmlns:wne="http://schemas.microsoft.com/office/word/2006/wordml" xmlns:wps="http://schemas.microsoft.com/office/word/2010/wordprocessingShape" mc:Ignorable="w14 w15 w16se wp14">
   <w:abstractNum w:abstractNumId="0" w15:restartNumberingAfterBreak="0">
+    <w:nsid w:val="03A03BC0"/>
+    <w:multiLevelType w:val="hybridMultilevel"/>
+    <w:tmpl w:val="5F62BA7C"/>
+    <w:lvl w:ilvl="0" w:tplc="747662C4">
+      <w:numFmt w:val="bullet"/>
+      <w:lvlText w:val="-"/>
+      <w:lvlJc w:val="left"/>
+      <w:pPr>
+        <w:ind w:left="720" w:hanging="360"/>
+      </w:pPr>
+      <w:rPr>
+        <w:rFonts w:ascii="Calibri" w:eastAsiaTheme="minorHAnsi" w:hAnsi="Calibri" w:cs="Calibri" w:hint="default"/>
+      </w:rPr>
+    </w:lvl>
+    <w:lvl w:ilvl="1" w:tplc="04090003" w:tentative="1">
+      <w:start w:val="1"/>
+      <w:numFmt w:val="bullet"/>
+      <w:lvlText w:val="o"/>
+      <w:lvlJc w:val="left"/>
+      <w:pPr>
+        <w:ind w:left="1440" w:hanging="360"/>
+      </w:pPr>
+      <w:rPr>
+        <w:rFonts w:ascii="Courier New" w:hAnsi="Courier New" w:cs="Courier New" w:hint="default"/>
+      </w:rPr>
+    </w:lvl>
+    <w:lvl w:ilvl="2" w:tplc="04090005" w:tentative="1">
+      <w:start w:val="1"/>
+      <w:numFmt w:val="bullet"/>
+      <w:lvlText w:val=""/>
+      <w:lvlJc w:val="left"/>
+      <w:pPr>
+        <w:ind w:left="2160" w:hanging="360"/>
+      </w:pPr>
+      <w:rPr>
+        <w:rFonts w:ascii="Wingdings" w:hAnsi="Wingdings" w:hint="default"/>
+      </w:rPr>
+    </w:lvl>
+    <w:lvl w:ilvl="3" w:tplc="04090001" w:tentative="1">
+      <w:start w:val="1"/>
+      <w:numFmt w:val="bullet"/>
+      <w:lvlText w:val=""/>
+      <w:lvlJc w:val="left"/>
+      <w:pPr>
+        <w:ind w:left="2880" w:hanging="360"/>
+      </w:pPr>
+      <w:rPr>
+        <w:rFonts w:ascii="Symbol" w:hAnsi="Symbol" w:hint="default"/>
+      </w:rPr>
+    </w:lvl>
+    <w:lvl w:ilvl="4" w:tplc="04090003" w:tentative="1">
+      <w:start w:val="1"/>
+      <w:numFmt w:val="bullet"/>
+      <w:lvlText w:val="o"/>
+      <w:lvlJc w:val="left"/>
+      <w:pPr>
+        <w:ind w:left="3600" w:hanging="360"/>
+      </w:pPr>
+      <w:rPr>
+        <w:rFonts w:ascii="Courier New" w:hAnsi="Courier New" w:cs="Courier New" w:hint="default"/>
+      </w:rPr>
+    </w:lvl>
+    <w:lvl w:ilvl="5" w:tplc="04090005" w:tentative="1">
+      <w:start w:val="1"/>
+      <w:numFmt w:val="bullet"/>
+      <w:lvlText w:val=""/>
+      <w:lvlJc w:val="left"/>
+      <w:pPr>
+        <w:ind w:left="4320" w:hanging="360"/>
+      </w:pPr>
+      <w:rPr>
+        <w:rFonts w:ascii="Wingdings" w:hAnsi="Wingdings" w:hint="default"/>
+      </w:rPr>
+    </w:lvl>
+    <w:lvl w:ilvl="6" w:tplc="04090001" w:tentative="1">
+      <w:start w:val="1"/>
+      <w:numFmt w:val="bullet"/>
+      <w:lvlText w:val=""/>
+      <w:lvlJc w:val="left"/>
+      <w:pPr>
+        <w:ind w:left="5040" w:hanging="360"/>
+      </w:pPr>
+      <w:rPr>
+        <w:rFonts w:ascii="Symbol" w:hAnsi="Symbol" w:hint="default"/>
+      </w:rPr>
+    </w:lvl>
+    <w:lvl w:ilvl="7" w:tplc="04090003" w:tentative="1">
+      <w:start w:val="1"/>
+      <w:numFmt w:val="bullet"/>
+      <w:lvlText w:val="o"/>
+      <w:lvlJc w:val="left"/>
+      <w:pPr>
+        <w:ind w:left="5760" w:hanging="360"/>
+      </w:pPr>
+      <w:rPr>
+        <w:rFonts w:ascii="Courier New" w:hAnsi="Courier New" w:cs="Courier New" w:hint="default"/>
+      </w:rPr>
+    </w:lvl>
+    <w:lvl w:ilvl="8" w:tplc="04090005" w:tentative="1">
+      <w:start w:val="1"/>
+      <w:numFmt w:val="bullet"/>
+      <w:lvlText w:val=""/>
+      <w:lvlJc w:val="left"/>
+      <w:pPr>
+        <w:ind w:left="6480" w:hanging="360"/>
+      </w:pPr>
+      <w:rPr>
+        <w:rFonts w:ascii="Wingdings" w:hAnsi="Wingdings" w:hint="default"/>
+      </w:rPr>
+    </w:lvl>
+  </w:abstractNum>
+  <w:abstractNum w:abstractNumId="1" w15:restartNumberingAfterBreak="0">
     <w:nsid w:val="0ED8192A"/>
     <w:multiLevelType w:val="hybridMultilevel"/>
     <w:tmpl w:val="F4027820"/>
@@ -596,7 +826,7 @@
       </w:pPr>
     </w:lvl>
   </w:abstractNum>
-  <w:abstractNum w:abstractNumId="1" w15:restartNumberingAfterBreak="0">
+  <w:abstractNum w:abstractNumId="2" w15:restartNumberingAfterBreak="0">
     <w:nsid w:val="58F33A51"/>
     <w:multiLevelType w:val="hybridMultilevel"/>
     <w:tmpl w:val="31E0DBBE"/>
@@ -686,9 +916,12 @@
     </w:lvl>
   </w:abstractNum>
   <w:num w:numId="1">
+    <w:abstractNumId w:val="2"/>
+  </w:num>
+  <w:num w:numId="2">
     <w:abstractNumId w:val="1"/>
   </w:num>
-  <w:num w:numId="2">
+  <w:num w:numId="3">
     <w:abstractNumId w:val="0"/>
   </w:num>
 </w:numbering>

</xml_diff>